<commit_message>
Rewrite internal/external reviews for Nesterenko thesis
Original review files were templated from another student (Romashov,
ІПЗм-23-2, motion-recognition topic). Replaced student identity, topic,
and substantive content to describe this thesis: vector embedding models
for semantic search in corporate KBs.

- Internal (Вечірська, ХНУРЕ): 4 body paragraphs at 13pt, fits 1 page.
  Focuses on scientific novelty, methodology (FAISS IndexFlatIP, bootstrap
  CIs), MCDA selection.
- External (Орєхов, НТУ ХПІ): 5 body paragraphs at 12pt, fits 1 page.
  Focuses on practical applicability, working Flask app, deployment
  potential for KB/support/legal/medical info systems.
- Grade left as «____» placeholder for the supervisor.
- Top margin reduced to 1.27 cm on both reviews.
- Reviewers: Ірина ВЕЧІРСЬКА (internal), Сергій ОРЄХОВ (external).

Co-Authored-By: Claude Opus 4.7 <noreply@anthropic.com>
</commit_message>
<xml_diff>
--- a/thesis/2026_М_ПІ_ІПЗм-24-1_Нестеренко_В_В_рецензія_внутрішня.docx
+++ b/thesis/2026_М_ПІ_ІПЗм-24-1_Нестеренко_В_В_рецензія_внутрішня.docx
@@ -95,102 +95,10 @@
       </w:pPr>
       <w:r>
         <w:rPr>
-          <w:sz w:val="28"/>
-          <w:szCs w:val="28"/>
-        </w:rPr>
-        <w:t>групи ІПЗм-23-</w:t>
-      </w:r>
-      <w:r>
-        <w:rPr>
-          <w:sz w:val="28"/>
-          <w:szCs w:val="28"/>
-          <w:lang w:val="ru-RU"/>
-        </w:rPr>
-        <w:t>2</w:t>
-      </w:r>
-      <w:r>
-        <w:rPr>
-          <w:sz w:val="28"/>
-          <w:szCs w:val="28"/>
-        </w:rPr>
-        <w:t xml:space="preserve"> Ромашова Володимира Вадимовича спеціальність</w:t>
-      </w:r>
-      <w:r>
-        <w:rPr>
-          <w:spacing w:val="-5"/>
-          <w:sz w:val="28"/>
-          <w:szCs w:val="28"/>
-        </w:rPr>
-        <w:t xml:space="preserve"> </w:t>
-      </w:r>
-      <w:r>
-        <w:rPr>
-          <w:b/>
-          <w:sz w:val="28"/>
-          <w:szCs w:val="28"/>
-        </w:rPr>
-        <w:t>–</w:t>
-      </w:r>
-      <w:r>
-        <w:rPr>
-          <w:b/>
-          <w:spacing w:val="-7"/>
-          <w:sz w:val="28"/>
-          <w:szCs w:val="28"/>
-        </w:rPr>
-        <w:t xml:space="preserve"> </w:t>
-      </w:r>
-      <w:r>
-        <w:rPr>
-          <w:sz w:val="28"/>
-          <w:szCs w:val="28"/>
-        </w:rPr>
-        <w:t>121-</w:t>
-      </w:r>
-      <w:r>
-        <w:rPr>
-          <w:spacing w:val="-8"/>
-          <w:sz w:val="28"/>
-          <w:szCs w:val="28"/>
-        </w:rPr>
-        <w:t xml:space="preserve"> </w:t>
-      </w:r>
-      <w:r>
-        <w:rPr>
-          <w:sz w:val="28"/>
-          <w:szCs w:val="28"/>
-        </w:rPr>
-        <w:t>Інженерія</w:t>
-      </w:r>
-      <w:r>
-        <w:rPr>
-          <w:spacing w:val="-7"/>
-          <w:sz w:val="28"/>
-          <w:szCs w:val="28"/>
-        </w:rPr>
-        <w:t xml:space="preserve"> </w:t>
-      </w:r>
-      <w:r>
-        <w:rPr>
-          <w:sz w:val="28"/>
-          <w:szCs w:val="28"/>
-        </w:rPr>
-        <w:t>програмного</w:t>
-      </w:r>
-      <w:r>
-        <w:rPr>
-          <w:spacing w:val="-7"/>
-          <w:sz w:val="28"/>
-          <w:szCs w:val="28"/>
-        </w:rPr>
-        <w:t xml:space="preserve"> </w:t>
-      </w:r>
-      <w:r>
-        <w:rPr>
-          <w:sz w:val="28"/>
-          <w:szCs w:val="28"/>
-        </w:rPr>
-        <w:t>забезпечення</w:t>
+          <w:sz w:val="26"/>
+          <w:szCs w:val="28"/>
+        </w:rPr>
+        <w:t>групи ІПЗм-24-1 Нестеренка Віталія Вячеславовича спеціальність – 121- Інженерія програмного забезпечення</w:t>
       </w:r>
     </w:p>
     <w:p>
@@ -201,87 +109,17 @@
           <w:szCs w:val="28"/>
         </w:rPr>
       </w:pPr>
-      <w:proofErr w:type="spellStart"/>
-      <w:r>
-        <w:rPr>
-          <w:sz w:val="28"/>
-          <w:szCs w:val="28"/>
-        </w:rPr>
-        <w:t>освітньо</w:t>
-      </w:r>
-      <w:proofErr w:type="spellEnd"/>
-      <w:r>
-        <w:rPr>
-          <w:sz w:val="28"/>
-          <w:szCs w:val="28"/>
-        </w:rPr>
-        <w:t>-наукова</w:t>
-      </w:r>
-      <w:r>
-        <w:rPr>
-          <w:spacing w:val="-8"/>
-          <w:sz w:val="28"/>
-          <w:szCs w:val="28"/>
-        </w:rPr>
-        <w:t xml:space="preserve"> </w:t>
-      </w:r>
-      <w:r>
-        <w:rPr>
-          <w:sz w:val="28"/>
-          <w:szCs w:val="28"/>
-        </w:rPr>
-        <w:t>програма</w:t>
-      </w:r>
-      <w:r>
-        <w:rPr>
-          <w:spacing w:val="-2"/>
-          <w:sz w:val="28"/>
-          <w:szCs w:val="28"/>
-        </w:rPr>
-        <w:t xml:space="preserve"> </w:t>
-      </w:r>
-      <w:r>
-        <w:rPr>
-          <w:sz w:val="28"/>
-          <w:szCs w:val="28"/>
-        </w:rPr>
-        <w:t>«Інженерія</w:t>
-      </w:r>
-      <w:r>
-        <w:rPr>
-          <w:spacing w:val="-5"/>
-          <w:sz w:val="28"/>
-          <w:szCs w:val="28"/>
-        </w:rPr>
-        <w:t xml:space="preserve"> </w:t>
-      </w:r>
-      <w:r>
-        <w:rPr>
-          <w:sz w:val="28"/>
-          <w:szCs w:val="28"/>
-        </w:rPr>
-        <w:t>програмного</w:t>
-      </w:r>
-      <w:r>
-        <w:rPr>
-          <w:spacing w:val="-5"/>
-          <w:sz w:val="28"/>
-          <w:szCs w:val="28"/>
-        </w:rPr>
-        <w:t xml:space="preserve"> </w:t>
-      </w:r>
-      <w:r>
-        <w:rPr>
-          <w:spacing w:val="-2"/>
-          <w:sz w:val="28"/>
-          <w:szCs w:val="28"/>
-        </w:rPr>
-        <w:t>забезпечення»</w:t>
-      </w:r>
-    </w:p>
-    <w:p>
-      <w:pPr>
-        <w:pStyle w:val="ae"/>
+      <w:r>
+        <w:rPr>
+          <w:sz w:val="26"/>
+          <w:szCs w:val="28"/>
+        </w:rPr>
+        <w:t>освітньо-наукова програма «Інженерія програмного забезпечення»</w:t>
+      </w:r>
+    </w:p>
+    <w:p>
+      <w:pPr>
+        <w:pStyle w:val="BodyText"/>
         <w:ind w:left="0"/>
       </w:pPr>
     </w:p>
@@ -297,36 +135,11 @@
       </w:pPr>
       <w:r>
         <w:rPr>
-          <w:sz w:val="28"/>
+          <w:sz w:val="26"/>
           <w:szCs w:val="28"/>
           <w:u w:val="single"/>
         </w:rPr>
-        <w:t>«</w:t>
-      </w:r>
-      <w:r>
-        <w:rPr>
-          <w:sz w:val="28"/>
-          <w:szCs w:val="28"/>
-          <w:u w:val="single"/>
-        </w:rPr>
-        <w:t>Дослідження алгоритмів розпізнавання рухів для мобільних застосунків, призначених для відстеження фізичної активності користувачів</w:t>
-      </w:r>
-      <w:r>
-        <w:rPr>
-          <w:spacing w:val="-2"/>
-          <w:sz w:val="28"/>
-          <w:szCs w:val="28"/>
-          <w:u w:val="single"/>
-        </w:rPr>
-        <w:t>»</w:t>
-      </w:r>
-      <w:r>
-        <w:rPr>
-          <w:sz w:val="28"/>
-          <w:szCs w:val="28"/>
-          <w:u w:val="single"/>
-        </w:rPr>
-        <w:t xml:space="preserve"> </w:t>
+        <w:t>«Дослідження моделей векторних ембеддінгів для семантичного пошуку текстових даних у корпоративних базах знань»</w:t>
       </w:r>
     </w:p>
     <w:p>
@@ -379,7 +192,7 @@
     </w:p>
     <w:p>
       <w:pPr>
-        <w:pStyle w:val="ae"/>
+        <w:pStyle w:val="BodyText"/>
         <w:ind w:left="0"/>
       </w:pPr>
     </w:p>
@@ -390,150 +203,14 @@
         <w:rPr>
           <w:sz w:val="28"/>
           <w:szCs w:val="28"/>
-          <w:lang/>
-        </w:rPr>
-      </w:pPr>
-      <w:r>
-        <w:rPr>
-          <w:sz w:val="28"/>
-          <w:szCs w:val="28"/>
-        </w:rPr>
-        <w:t>Представлена</w:t>
-      </w:r>
-      <w:r>
-        <w:rPr>
-          <w:spacing w:val="-5"/>
-          <w:sz w:val="28"/>
-          <w:szCs w:val="28"/>
-        </w:rPr>
-        <w:t xml:space="preserve"> </w:t>
-      </w:r>
-      <w:r>
-        <w:rPr>
-          <w:sz w:val="28"/>
-          <w:szCs w:val="28"/>
-        </w:rPr>
-        <w:t>робота</w:t>
-      </w:r>
-      <w:r>
-        <w:rPr>
-          <w:spacing w:val="-3"/>
-          <w:sz w:val="28"/>
-          <w:szCs w:val="28"/>
-        </w:rPr>
-        <w:t xml:space="preserve"> </w:t>
-      </w:r>
-      <w:r>
-        <w:rPr>
-          <w:sz w:val="28"/>
-          <w:szCs w:val="28"/>
-        </w:rPr>
-        <w:t>відповідає</w:t>
-      </w:r>
-      <w:r>
-        <w:rPr>
-          <w:spacing w:val="-5"/>
-          <w:sz w:val="28"/>
-          <w:szCs w:val="28"/>
-        </w:rPr>
-        <w:t xml:space="preserve"> </w:t>
-      </w:r>
-      <w:r>
-        <w:rPr>
-          <w:sz w:val="28"/>
-          <w:szCs w:val="28"/>
-        </w:rPr>
-        <w:t>затвердженій</w:t>
-      </w:r>
-      <w:r>
-        <w:rPr>
-          <w:spacing w:val="-5"/>
-          <w:sz w:val="28"/>
-          <w:szCs w:val="28"/>
-        </w:rPr>
-        <w:t xml:space="preserve"> </w:t>
-      </w:r>
-      <w:r>
-        <w:rPr>
-          <w:sz w:val="28"/>
-          <w:szCs w:val="28"/>
-        </w:rPr>
-        <w:t>темі</w:t>
-      </w:r>
-      <w:r>
-        <w:rPr>
-          <w:spacing w:val="-4"/>
-          <w:sz w:val="28"/>
-          <w:szCs w:val="28"/>
-        </w:rPr>
-        <w:t xml:space="preserve"> </w:t>
-      </w:r>
-      <w:r>
-        <w:rPr>
-          <w:sz w:val="28"/>
-          <w:szCs w:val="28"/>
-        </w:rPr>
-        <w:t>та</w:t>
-      </w:r>
-      <w:r>
-        <w:rPr>
-          <w:spacing w:val="-5"/>
-          <w:sz w:val="28"/>
-          <w:szCs w:val="28"/>
-        </w:rPr>
-        <w:t xml:space="preserve"> </w:t>
-      </w:r>
-      <w:r>
-        <w:rPr>
-          <w:sz w:val="28"/>
-          <w:szCs w:val="28"/>
-        </w:rPr>
-        <w:t>виконана</w:t>
-      </w:r>
-      <w:r>
-        <w:rPr>
-          <w:spacing w:val="-5"/>
-          <w:sz w:val="28"/>
-          <w:szCs w:val="28"/>
-        </w:rPr>
-        <w:t xml:space="preserve"> </w:t>
-      </w:r>
-      <w:r>
-        <w:rPr>
-          <w:sz w:val="28"/>
-          <w:szCs w:val="28"/>
-        </w:rPr>
-        <w:t>відповідно</w:t>
-      </w:r>
-      <w:r>
-        <w:rPr>
-          <w:spacing w:val="-4"/>
-          <w:sz w:val="28"/>
-          <w:szCs w:val="28"/>
-        </w:rPr>
-        <w:t xml:space="preserve"> </w:t>
-      </w:r>
-      <w:r>
-        <w:rPr>
-          <w:sz w:val="28"/>
-          <w:szCs w:val="28"/>
-        </w:rPr>
-        <w:t>до</w:t>
-      </w:r>
-      <w:r>
-        <w:rPr>
-          <w:spacing w:val="-4"/>
-          <w:sz w:val="28"/>
-          <w:szCs w:val="28"/>
-        </w:rPr>
-        <w:t xml:space="preserve"> </w:t>
-      </w:r>
-      <w:r>
-        <w:rPr>
-          <w:sz w:val="28"/>
-          <w:szCs w:val="28"/>
-        </w:rPr>
-        <w:t xml:space="preserve">завдання. </w:t>
+        </w:rPr>
+      </w:pPr>
+      <w:r>
+        <w:rPr>
+          <w:sz w:val="26"/>
+          <w:szCs w:val="28"/>
+        </w:rPr>
+        <w:t xml:space="preserve">Представлена робота відповідає затвердженій темі та виконана відповідно до завдання. </w:t>
       </w:r>
     </w:p>
     <w:p>
@@ -547,59 +224,10 @@
       </w:pPr>
       <w:r>
         <w:rPr>
-          <w:sz w:val="28"/>
-          <w:szCs w:val="28"/>
-        </w:rPr>
-        <w:t xml:space="preserve">Дослідження є актуальним у контексті зростання популярності мобільних застосунків для моніторингу здоров’я та фізичної активності. </w:t>
-      </w:r>
-      <w:r>
-        <w:rPr>
-          <w:sz w:val="28"/>
-          <w:szCs w:val="28"/>
-        </w:rPr>
-        <w:t>Здобувач</w:t>
-      </w:r>
-      <w:r>
-        <w:rPr>
-          <w:sz w:val="28"/>
-          <w:szCs w:val="28"/>
-        </w:rPr>
-        <w:t xml:space="preserve"> обґрунт</w:t>
-      </w:r>
-      <w:r>
-        <w:rPr>
-          <w:sz w:val="28"/>
-          <w:szCs w:val="28"/>
-        </w:rPr>
-        <w:t>у</w:t>
-      </w:r>
-      <w:r>
-        <w:rPr>
-          <w:sz w:val="28"/>
-          <w:szCs w:val="28"/>
-        </w:rPr>
-        <w:t>в</w:t>
-      </w:r>
-      <w:r>
-        <w:rPr>
-          <w:sz w:val="28"/>
-          <w:szCs w:val="28"/>
-        </w:rPr>
-        <w:t>ав</w:t>
-      </w:r>
-      <w:r>
-        <w:rPr>
-          <w:sz w:val="28"/>
-          <w:szCs w:val="28"/>
-        </w:rPr>
-        <w:t xml:space="preserve"> потребу в розробці точних, енергоефективних і адаптивних алгоритмів, які можуть працювати на пристроях із обмеженими ресурсами, що відповідає сучасним викликам у сфері мобільних технологій</w:t>
-      </w:r>
-      <w:r>
-        <w:rPr>
-          <w:sz w:val="28"/>
-          <w:szCs w:val="28"/>
-        </w:rPr>
-        <w:t>.</w:t>
+          <w:sz w:val="26"/>
+          <w:szCs w:val="28"/>
+        </w:rPr>
+        <w:t>Дослідження є актуальним у контексті стрімкого зростання обсягів корпоративних знань у текстовій формі та обмеженості традиційного лексичного пошуку, який погано справляється з синонімією, перефразуванням і мультимовним контентом. Здобувач обґрунтував потребу в застосуванні сучасних моделей векторних ембеддінгів для побудови систем семантичного пошуку, орієнтованих на корпоративні бази знань, у тому числі україномовні.</w:t>
       </w:r>
     </w:p>
     <w:p>
@@ -613,88 +241,10 @@
       </w:pPr>
       <w:r>
         <w:rPr>
-          <w:sz w:val="28"/>
-          <w:szCs w:val="28"/>
-        </w:rPr>
-        <w:t xml:space="preserve">Наукова новизна </w:t>
-      </w:r>
-      <w:r>
-        <w:rPr>
-          <w:sz w:val="28"/>
-          <w:szCs w:val="28"/>
-        </w:rPr>
-        <w:t>п</w:t>
-      </w:r>
-      <w:r>
-        <w:rPr>
-          <w:sz w:val="28"/>
-          <w:szCs w:val="28"/>
-        </w:rPr>
-        <w:t xml:space="preserve">олягає у комплексному порівнянні п’яти алгоритмів розпізнавання рухів </w:t>
-      </w:r>
-      <w:r>
-        <w:rPr>
-          <w:sz w:val="28"/>
-          <w:szCs w:val="28"/>
-          <w:lang w:val="en-US"/>
-        </w:rPr>
-        <w:t>– Decision Trees, Random Forest, Convolutional Neural Networks, Hidden Markov Models і Support Vector Machines.</w:t>
-      </w:r>
-      <w:r>
-        <w:rPr>
-          <w:sz w:val="28"/>
-          <w:szCs w:val="28"/>
-        </w:rPr>
-        <w:t xml:space="preserve"> </w:t>
-      </w:r>
-      <w:r>
-        <w:rPr>
-          <w:sz w:val="28"/>
-          <w:szCs w:val="28"/>
-        </w:rPr>
-        <w:t>У роботі</w:t>
-      </w:r>
-      <w:r>
-        <w:rPr>
-          <w:sz w:val="28"/>
-          <w:szCs w:val="28"/>
-        </w:rPr>
-        <w:t xml:space="preserve"> використ</w:t>
-      </w:r>
-      <w:r>
-        <w:rPr>
-          <w:sz w:val="28"/>
-          <w:szCs w:val="28"/>
-        </w:rPr>
-        <w:t>ано</w:t>
-      </w:r>
-      <w:r>
-        <w:rPr>
-          <w:sz w:val="28"/>
-          <w:szCs w:val="28"/>
-        </w:rPr>
-        <w:t xml:space="preserve"> багатокритеріальний аналіз, враховуючи точність, швидкість, енергоспоживання й адаптивність, а також застосов</w:t>
-      </w:r>
-      <w:r>
-        <w:rPr>
-          <w:sz w:val="28"/>
-          <w:szCs w:val="28"/>
-        </w:rPr>
-        <w:t>ано</w:t>
-      </w:r>
-      <w:r>
-        <w:rPr>
-          <w:sz w:val="28"/>
-          <w:szCs w:val="28"/>
-        </w:rPr>
-        <w:t xml:space="preserve"> метод аналізу ієрархій для оцінки алгоритмів і принцип Парето для вибору оптимальних рішень</w:t>
-      </w:r>
-      <w:r>
-        <w:rPr>
-          <w:sz w:val="28"/>
-          <w:szCs w:val="28"/>
-        </w:rPr>
-        <w:t xml:space="preserve">. </w:t>
+          <w:sz w:val="26"/>
+          <w:szCs w:val="28"/>
+        </w:rPr>
+        <w:t>Наукова новизна полягає у комплексному порівняльному дослідженні чотирьох сучасних моделей векторних ембеддінгів — multilingual-E5-base, BGE-M3, Qwen3-Embedding-0.6B та nomic-embed-text-v1.5 — у поєднанні з лексичною baseline-моделлю BM25, проведеному на трьох різнопрофільних доменах знань (технічна документація, юридичні тексти, медичні матеріали). Достовірність результатів підтверджується застосуванням бутстреп-оцінки 95% довірчих інтервалів (n = 2000) для метрик якості ранжування.</w:t>
       </w:r>
     </w:p>
     <w:p>
@@ -708,46 +258,10 @@
       </w:pPr>
       <w:r>
         <w:rPr>
-          <w:sz w:val="28"/>
-          <w:szCs w:val="28"/>
-        </w:rPr>
-        <w:t>Дослідження є доцільним, має прикладну цінність і супроводжується реалізацією мобільного</w:t>
-      </w:r>
-      <w:r>
-        <w:rPr>
-          <w:sz w:val="28"/>
-          <w:szCs w:val="28"/>
-        </w:rPr>
-        <w:t xml:space="preserve"> </w:t>
-      </w:r>
-      <w:r>
-        <w:rPr>
-          <w:sz w:val="28"/>
-          <w:szCs w:val="28"/>
-          <w:lang w:val="en-US"/>
-        </w:rPr>
-        <w:t>Android</w:t>
-      </w:r>
-      <w:r>
-        <w:rPr>
-          <w:sz w:val="28"/>
-          <w:szCs w:val="28"/>
-        </w:rPr>
-        <w:t>-застосунку</w:t>
-      </w:r>
-      <w:r>
-        <w:rPr>
-          <w:sz w:val="28"/>
-          <w:szCs w:val="28"/>
-        </w:rPr>
-        <w:t>, що свідчить про практичне впровадження отриманих результатів.</w:t>
-      </w:r>
-      <w:r>
-        <w:rPr>
-          <w:sz w:val="28"/>
-          <w:szCs w:val="28"/>
-        </w:rPr>
-        <w:t xml:space="preserve"> </w:t>
+          <w:sz w:val="26"/>
+          <w:szCs w:val="28"/>
+        </w:rPr>
+        <w:t>Методологічна частина виконана коректно: для індексації використано бібліотеку FAISS з точним індексом IndexFlatIP та L2-нормалізованими векторами (еквівалент косинусної міри), якість оцінено за стандартними IR-метриками nDCG@10, MRR@10, Recall@10, Precision@10, для вибору моделі застосовано Парето-фронт і лінійну адитивну модель MCDA. Дослідження супроводжується реалізацією веб-застосунку на базі Flask, що охоплює повний цикл — чанкування, побудову індексів, семантичний пошук, обчислення метрик та аналіз результатів за окремими запитами.</w:t>
       </w:r>
     </w:p>
     <w:p>
@@ -761,24 +275,10 @@
       </w:pPr>
       <w:r>
         <w:rPr>
-          <w:sz w:val="28"/>
-          <w:szCs w:val="28"/>
-        </w:rPr>
-        <w:t>Недоліком роботи можна вважати обмежену кількість тестових даних і користувачів під час експерименту, а також відсутність розгорнутого аналізу індивідуальних відмінностей користувачів (вік, фізіологія), що може впливати на точність розпізнавання.</w:t>
-      </w:r>
-      <w:r>
-        <w:rPr>
-          <w:sz w:val="28"/>
-          <w:szCs w:val="28"/>
-        </w:rPr>
-        <w:t xml:space="preserve"> </w:t>
-      </w:r>
-      <w:r>
-        <w:rPr>
-          <w:sz w:val="28"/>
-          <w:szCs w:val="28"/>
-        </w:rPr>
-        <w:t>Попри зазначене, робота є цілісною, завершеною та має наукову і практичну цінність.</w:t>
+          <w:sz w:val="26"/>
+          <w:szCs w:val="28"/>
+        </w:rPr>
+        <w:t>Недоліком роботи можна вважати обмежену кількість запитів і релевантних документів у бенчмарках за окремими доменами, а також відсутність експериментів із дотренуванням (fine-tuning) моделей на доменних даних, що могло б додатково підвищити якість пошуку. Попри зазначене, робота є цілісною, завершеною та має наукову і практичну цінність.</w:t>
       </w:r>
     </w:p>
     <w:p>
@@ -792,68 +292,10 @@
       </w:pPr>
       <w:r>
         <w:rPr>
-          <w:sz w:val="28"/>
-          <w:szCs w:val="28"/>
-        </w:rPr>
-        <w:t>Кваліфікаційна робота магістра, здобувача групи ІПЗм-23-2 Ромашова Володимира Вадимовича відповідає вимогам до кваліфікаційних робіт і заслуговує оцінки «</w:t>
-      </w:r>
-      <w:r>
-        <w:rPr>
-          <w:sz w:val="28"/>
-          <w:szCs w:val="28"/>
-        </w:rPr>
-        <w:t>відмінно</w:t>
-      </w:r>
-      <w:r>
-        <w:rPr>
-          <w:sz w:val="28"/>
-          <w:szCs w:val="28"/>
-        </w:rPr>
-        <w:t xml:space="preserve"> – </w:t>
-      </w:r>
-      <w:r>
-        <w:rPr>
-          <w:sz w:val="28"/>
-          <w:szCs w:val="28"/>
-        </w:rPr>
-        <w:t>90</w:t>
-      </w:r>
-      <w:r>
-        <w:rPr>
-          <w:sz w:val="28"/>
-          <w:szCs w:val="28"/>
-        </w:rPr>
-        <w:t xml:space="preserve"> </w:t>
-      </w:r>
-      <w:r>
-        <w:rPr>
-          <w:sz w:val="28"/>
-          <w:szCs w:val="28"/>
-        </w:rPr>
-        <w:t>В</w:t>
-      </w:r>
-      <w:r>
-        <w:rPr>
-          <w:sz w:val="28"/>
-          <w:szCs w:val="28"/>
-        </w:rPr>
-        <w:t xml:space="preserve">». Кваліфікаційну роботу здобувача групи ІПЗм-23-2 Ромашова В.В. можна представити до захисту в ЕК за спеціальністю 121 – «Інженерія програмного забезпечення», </w:t>
-      </w:r>
-      <w:proofErr w:type="spellStart"/>
-      <w:r>
-        <w:rPr>
-          <w:sz w:val="28"/>
-          <w:szCs w:val="28"/>
-        </w:rPr>
-        <w:t>освітньо</w:t>
-      </w:r>
-      <w:proofErr w:type="spellEnd"/>
-      <w:r>
-        <w:rPr>
-          <w:sz w:val="28"/>
-          <w:szCs w:val="28"/>
-        </w:rPr>
-        <w:t>-наукова програма «Інженерія програмного забезпечення».</w:t>
+          <w:sz w:val="26"/>
+          <w:szCs w:val="28"/>
+        </w:rPr>
+        <w:t>Кваліфікаційна робота магістра, здобувача групи ІПЗм-24-1 Нестеренка Віталія Вячеславовича відповідає вимогам до кваліфікаційних робіт і заслуговує оцінки «____». Кваліфікаційну роботу здобувача групи ІПЗм-24-1 Нестеренка В.В. можна представити до захисту в ЕК за спеціальністю 121 – «Інженерія програмного забезпечення», освітньо-наукова програма «Інженерія програмного забезпечення».</w:t>
       </w:r>
     </w:p>
     <w:p>
@@ -868,19 +310,19 @@
     </w:p>
     <w:p>
       <w:pPr>
-        <w:pStyle w:val="ae"/>
+        <w:pStyle w:val="BodyText"/>
         <w:ind w:left="0"/>
       </w:pPr>
     </w:p>
     <w:p>
       <w:pPr>
-        <w:pStyle w:val="ae"/>
+        <w:pStyle w:val="BodyText"/>
         <w:ind w:left="0"/>
       </w:pPr>
     </w:p>
     <w:p>
       <w:pPr>
-        <w:pStyle w:val="ae"/>
+        <w:pStyle w:val="BodyText"/>
         <w:spacing w:before="1"/>
         <w:ind w:left="0"/>
       </w:pPr>
@@ -915,94 +357,25 @@
           <w:szCs w:val="28"/>
         </w:rPr>
       </w:pPr>
-      <w:proofErr w:type="spellStart"/>
-      <w:r>
-        <w:rPr>
-          <w:sz w:val="28"/>
-          <w:szCs w:val="28"/>
-        </w:rPr>
-        <w:t>к.т.н</w:t>
-      </w:r>
-      <w:proofErr w:type="spellEnd"/>
-      <w:r>
-        <w:rPr>
-          <w:sz w:val="28"/>
-          <w:szCs w:val="28"/>
-        </w:rPr>
-        <w:t>.,</w:t>
-      </w:r>
-      <w:r>
-        <w:rPr>
-          <w:spacing w:val="-3"/>
-          <w:sz w:val="28"/>
-          <w:szCs w:val="28"/>
-        </w:rPr>
-        <w:t xml:space="preserve"> </w:t>
-      </w:r>
-      <w:r>
-        <w:rPr>
-          <w:sz w:val="28"/>
-          <w:szCs w:val="28"/>
-        </w:rPr>
-        <w:t>доцент</w:t>
-      </w:r>
-      <w:r>
-        <w:rPr>
-          <w:spacing w:val="-3"/>
-          <w:sz w:val="28"/>
-          <w:szCs w:val="28"/>
-        </w:rPr>
-        <w:t xml:space="preserve"> </w:t>
-      </w:r>
-      <w:r>
-        <w:rPr>
-          <w:sz w:val="28"/>
-          <w:szCs w:val="28"/>
-        </w:rPr>
-        <w:t>каф.</w:t>
-      </w:r>
-      <w:r>
-        <w:rPr>
-          <w:spacing w:val="-3"/>
-          <w:sz w:val="28"/>
-          <w:szCs w:val="28"/>
-        </w:rPr>
-        <w:t xml:space="preserve"> </w:t>
-      </w:r>
-      <w:r>
-        <w:rPr>
-          <w:spacing w:val="-5"/>
-          <w:sz w:val="28"/>
-          <w:szCs w:val="28"/>
-        </w:rPr>
-        <w:t>Інформатики ХНУРЕ</w:t>
-      </w:r>
-      <w:r>
-        <w:rPr>
-          <w:sz w:val="28"/>
+      <w:r>
+        <w:rPr>
+          <w:sz w:val="26"/>
+          <w:szCs w:val="28"/>
+        </w:rPr>
+        <w:t>к.т.н., доцент каф. Інформатики ХНУРЕ</w:t>
+      </w:r>
+      <w:r>
+        <w:rPr>
+          <w:sz w:val="26"/>
           <w:szCs w:val="28"/>
         </w:rPr>
         <w:tab/>
-      </w:r>
-      <w:r>
-        <w:rPr>
-          <w:sz w:val="28"/>
-          <w:szCs w:val="28"/>
-        </w:rPr>
         <w:t>Ірина ВЕЧІРСЬКА</w:t>
       </w:r>
-    </w:p>
-    <w:p>
-      <w:pPr>
-        <w:rPr>
-          <w:sz w:val="28"/>
-          <w:szCs w:val="28"/>
-        </w:rPr>
-      </w:pPr>
     </w:p>
     <w:sectPr>
       <w:pgSz w:w="11906" w:h="16838"/>
-      <w:pgMar w:top="1440" w:right="424" w:bottom="284" w:left="993" w:header="708" w:footer="708" w:gutter="0"/>
+      <w:pgMar w:top="720" w:right="424" w:bottom="284" w:left="993" w:header="708" w:footer="708" w:gutter="0"/>
       <w:cols w:space="708"/>
       <w:docGrid w:linePitch="360"/>
     </w:sectPr>
@@ -1407,7 +780,7 @@
     <w:lsdException w:name="Unresolved Mention" w:semiHidden="1" w:unhideWhenUsed="1"/>
     <w:lsdException w:name="Smart Link" w:semiHidden="1" w:unhideWhenUsed="1"/>
   </w:latentStyles>
-  <w:style w:type="paragraph" w:default="1" w:styleId="a">
+  <w:style w:type="paragraph" w:default="1" w:styleId="Normal">
     <w:name w:val="Normal"/>
     <w:qFormat/>
     <w:rsid w:val="00853E0C"/>
@@ -1424,11 +797,11 @@
       <w14:ligatures w14:val="none"/>
     </w:rPr>
   </w:style>
-  <w:style w:type="paragraph" w:styleId="1">
+  <w:style w:type="paragraph" w:styleId="Heading1">
     <w:name w:val="heading 1"/>
-    <w:basedOn w:val="a"/>
-    <w:next w:val="a"/>
-    <w:link w:val="10"/>
+    <w:basedOn w:val="Normal"/>
+    <w:next w:val="Normal"/>
+    <w:link w:val="Heading1Char"/>
     <w:uiPriority w:val="9"/>
     <w:qFormat/>
     <w:rsid w:val="009C5BB0"/>
@@ -1451,11 +824,11 @@
       <w14:ligatures w14:val="standardContextual"/>
     </w:rPr>
   </w:style>
-  <w:style w:type="paragraph" w:styleId="2">
+  <w:style w:type="paragraph" w:styleId="Heading2">
     <w:name w:val="heading 2"/>
-    <w:basedOn w:val="a"/>
-    <w:next w:val="a"/>
-    <w:link w:val="20"/>
+    <w:basedOn w:val="Normal"/>
+    <w:next w:val="Normal"/>
+    <w:link w:val="Heading2Char"/>
     <w:uiPriority w:val="9"/>
     <w:semiHidden/>
     <w:unhideWhenUsed/>
@@ -1480,11 +853,11 @@
       <w14:ligatures w14:val="standardContextual"/>
     </w:rPr>
   </w:style>
-  <w:style w:type="paragraph" w:styleId="3">
+  <w:style w:type="paragraph" w:styleId="Heading3">
     <w:name w:val="heading 3"/>
-    <w:basedOn w:val="a"/>
-    <w:next w:val="a"/>
-    <w:link w:val="30"/>
+    <w:basedOn w:val="Normal"/>
+    <w:next w:val="Normal"/>
+    <w:link w:val="Heading3Char"/>
     <w:uiPriority w:val="9"/>
     <w:semiHidden/>
     <w:unhideWhenUsed/>
@@ -1509,11 +882,11 @@
       <w14:ligatures w14:val="standardContextual"/>
     </w:rPr>
   </w:style>
-  <w:style w:type="paragraph" w:styleId="4">
+  <w:style w:type="paragraph" w:styleId="Heading4">
     <w:name w:val="heading 4"/>
-    <w:basedOn w:val="a"/>
-    <w:next w:val="a"/>
-    <w:link w:val="40"/>
+    <w:basedOn w:val="Normal"/>
+    <w:next w:val="Normal"/>
+    <w:link w:val="Heading4Char"/>
     <w:uiPriority w:val="9"/>
     <w:semiHidden/>
     <w:unhideWhenUsed/>
@@ -1538,11 +911,11 @@
       <w14:ligatures w14:val="standardContextual"/>
     </w:rPr>
   </w:style>
-  <w:style w:type="paragraph" w:styleId="5">
+  <w:style w:type="paragraph" w:styleId="Heading5">
     <w:name w:val="heading 5"/>
-    <w:basedOn w:val="a"/>
-    <w:next w:val="a"/>
-    <w:link w:val="50"/>
+    <w:basedOn w:val="Normal"/>
+    <w:next w:val="Normal"/>
+    <w:link w:val="Heading5Char"/>
     <w:uiPriority w:val="9"/>
     <w:semiHidden/>
     <w:unhideWhenUsed/>
@@ -1565,11 +938,11 @@
       <w14:ligatures w14:val="standardContextual"/>
     </w:rPr>
   </w:style>
-  <w:style w:type="paragraph" w:styleId="6">
+  <w:style w:type="paragraph" w:styleId="Heading6">
     <w:name w:val="heading 6"/>
-    <w:basedOn w:val="a"/>
-    <w:next w:val="a"/>
-    <w:link w:val="60"/>
+    <w:basedOn w:val="Normal"/>
+    <w:next w:val="Normal"/>
+    <w:link w:val="Heading6Char"/>
     <w:uiPriority w:val="9"/>
     <w:semiHidden/>
     <w:unhideWhenUsed/>
@@ -1594,11 +967,11 @@
       <w14:ligatures w14:val="standardContextual"/>
     </w:rPr>
   </w:style>
-  <w:style w:type="paragraph" w:styleId="7">
+  <w:style w:type="paragraph" w:styleId="Heading7">
     <w:name w:val="heading 7"/>
-    <w:basedOn w:val="a"/>
-    <w:next w:val="a"/>
-    <w:link w:val="70"/>
+    <w:basedOn w:val="Normal"/>
+    <w:next w:val="Normal"/>
+    <w:link w:val="Heading7Char"/>
     <w:uiPriority w:val="9"/>
     <w:semiHidden/>
     <w:unhideWhenUsed/>
@@ -1621,11 +994,11 @@
       <w14:ligatures w14:val="standardContextual"/>
     </w:rPr>
   </w:style>
-  <w:style w:type="paragraph" w:styleId="8">
+  <w:style w:type="paragraph" w:styleId="Heading8">
     <w:name w:val="heading 8"/>
-    <w:basedOn w:val="a"/>
-    <w:next w:val="a"/>
-    <w:link w:val="80"/>
+    <w:basedOn w:val="Normal"/>
+    <w:next w:val="Normal"/>
+    <w:link w:val="Heading8Char"/>
     <w:uiPriority w:val="9"/>
     <w:semiHidden/>
     <w:unhideWhenUsed/>
@@ -1650,11 +1023,11 @@
       <w14:ligatures w14:val="standardContextual"/>
     </w:rPr>
   </w:style>
-  <w:style w:type="paragraph" w:styleId="9">
+  <w:style w:type="paragraph" w:styleId="Heading9">
     <w:name w:val="heading 9"/>
-    <w:basedOn w:val="a"/>
-    <w:next w:val="a"/>
-    <w:link w:val="90"/>
+    <w:basedOn w:val="Normal"/>
+    <w:next w:val="Normal"/>
+    <w:link w:val="Heading9Char"/>
     <w:uiPriority w:val="9"/>
     <w:semiHidden/>
     <w:unhideWhenUsed/>
@@ -1677,12 +1050,13 @@
       <w14:ligatures w14:val="standardContextual"/>
     </w:rPr>
   </w:style>
-  <w:style w:type="character" w:default="1" w:styleId="a0">
+  <w:style w:type="character" w:default="1" w:styleId="DefaultParagraphFont">
     <w:name w:val="Default Paragraph Font"/>
     <w:uiPriority w:val="1"/>
+    <w:semiHidden/>
     <w:unhideWhenUsed/>
   </w:style>
-  <w:style w:type="table" w:default="1" w:styleId="a1">
+  <w:style w:type="table" w:default="1" w:styleId="TableNormal">
     <w:name w:val="Normal Table"/>
     <w:uiPriority w:val="99"/>
     <w:semiHidden/>
@@ -1697,16 +1071,16 @@
       </w:tblCellMar>
     </w:tblPr>
   </w:style>
-  <w:style w:type="numbering" w:default="1" w:styleId="a2">
+  <w:style w:type="numbering" w:default="1" w:styleId="NoList">
     <w:name w:val="No List"/>
     <w:uiPriority w:val="99"/>
     <w:semiHidden/>
     <w:unhideWhenUsed/>
   </w:style>
-  <w:style w:type="character" w:customStyle="1" w:styleId="10">
-    <w:name w:val="Заголовок 1 Знак"/>
-    <w:basedOn w:val="a0"/>
-    <w:link w:val="1"/>
+  <w:style w:type="character" w:customStyle="1" w:styleId="Heading1Char">
+    <w:name w:val="Heading 1 Char"/>
+    <w:basedOn w:val="DefaultParagraphFont"/>
+    <w:link w:val="Heading1"/>
     <w:uiPriority w:val="9"/>
     <w:rsid w:val="009C5BB0"/>
     <w:rPr>
@@ -1716,10 +1090,10 @@
       <w:szCs w:val="40"/>
     </w:rPr>
   </w:style>
-  <w:style w:type="character" w:customStyle="1" w:styleId="20">
-    <w:name w:val="Заголовок 2 Знак"/>
-    <w:basedOn w:val="a0"/>
-    <w:link w:val="2"/>
+  <w:style w:type="character" w:customStyle="1" w:styleId="Heading2Char">
+    <w:name w:val="Heading 2 Char"/>
+    <w:basedOn w:val="DefaultParagraphFont"/>
+    <w:link w:val="Heading2"/>
     <w:uiPriority w:val="9"/>
     <w:semiHidden/>
     <w:rsid w:val="009C5BB0"/>
@@ -1730,10 +1104,10 @@
       <w:szCs w:val="32"/>
     </w:rPr>
   </w:style>
-  <w:style w:type="character" w:customStyle="1" w:styleId="30">
-    <w:name w:val="Заголовок 3 Знак"/>
-    <w:basedOn w:val="a0"/>
-    <w:link w:val="3"/>
+  <w:style w:type="character" w:customStyle="1" w:styleId="Heading3Char">
+    <w:name w:val="Heading 3 Char"/>
+    <w:basedOn w:val="DefaultParagraphFont"/>
+    <w:link w:val="Heading3"/>
     <w:uiPriority w:val="9"/>
     <w:semiHidden/>
     <w:rsid w:val="009C5BB0"/>
@@ -1744,10 +1118,10 @@
       <w:szCs w:val="28"/>
     </w:rPr>
   </w:style>
-  <w:style w:type="character" w:customStyle="1" w:styleId="40">
-    <w:name w:val="Заголовок 4 Знак"/>
-    <w:basedOn w:val="a0"/>
-    <w:link w:val="4"/>
+  <w:style w:type="character" w:customStyle="1" w:styleId="Heading4Char">
+    <w:name w:val="Heading 4 Char"/>
+    <w:basedOn w:val="DefaultParagraphFont"/>
+    <w:link w:val="Heading4"/>
     <w:uiPriority w:val="9"/>
     <w:semiHidden/>
     <w:rsid w:val="009C5BB0"/>
@@ -1758,10 +1132,10 @@
       <w:color w:val="0F4761" w:themeColor="accent1" w:themeShade="BF"/>
     </w:rPr>
   </w:style>
-  <w:style w:type="character" w:customStyle="1" w:styleId="50">
-    <w:name w:val="Заголовок 5 Знак"/>
-    <w:basedOn w:val="a0"/>
-    <w:link w:val="5"/>
+  <w:style w:type="character" w:customStyle="1" w:styleId="Heading5Char">
+    <w:name w:val="Heading 5 Char"/>
+    <w:basedOn w:val="DefaultParagraphFont"/>
+    <w:link w:val="Heading5"/>
     <w:uiPriority w:val="9"/>
     <w:semiHidden/>
     <w:rsid w:val="009C5BB0"/>
@@ -1770,10 +1144,10 @@
       <w:color w:val="0F4761" w:themeColor="accent1" w:themeShade="BF"/>
     </w:rPr>
   </w:style>
-  <w:style w:type="character" w:customStyle="1" w:styleId="60">
-    <w:name w:val="Заголовок 6 Знак"/>
-    <w:basedOn w:val="a0"/>
-    <w:link w:val="6"/>
+  <w:style w:type="character" w:customStyle="1" w:styleId="Heading6Char">
+    <w:name w:val="Heading 6 Char"/>
+    <w:basedOn w:val="DefaultParagraphFont"/>
+    <w:link w:val="Heading6"/>
     <w:uiPriority w:val="9"/>
     <w:semiHidden/>
     <w:rsid w:val="009C5BB0"/>
@@ -1784,10 +1158,10 @@
       <w:color w:val="595959" w:themeColor="text1" w:themeTint="A6"/>
     </w:rPr>
   </w:style>
-  <w:style w:type="character" w:customStyle="1" w:styleId="70">
-    <w:name w:val="Заголовок 7 Знак"/>
-    <w:basedOn w:val="a0"/>
-    <w:link w:val="7"/>
+  <w:style w:type="character" w:customStyle="1" w:styleId="Heading7Char">
+    <w:name w:val="Heading 7 Char"/>
+    <w:basedOn w:val="DefaultParagraphFont"/>
+    <w:link w:val="Heading7"/>
     <w:uiPriority w:val="9"/>
     <w:semiHidden/>
     <w:rsid w:val="009C5BB0"/>
@@ -1796,10 +1170,10 @@
       <w:color w:val="595959" w:themeColor="text1" w:themeTint="A6"/>
     </w:rPr>
   </w:style>
-  <w:style w:type="character" w:customStyle="1" w:styleId="80">
-    <w:name w:val="Заголовок 8 Знак"/>
-    <w:basedOn w:val="a0"/>
-    <w:link w:val="8"/>
+  <w:style w:type="character" w:customStyle="1" w:styleId="Heading8Char">
+    <w:name w:val="Heading 8 Char"/>
+    <w:basedOn w:val="DefaultParagraphFont"/>
+    <w:link w:val="Heading8"/>
     <w:uiPriority w:val="9"/>
     <w:semiHidden/>
     <w:rsid w:val="009C5BB0"/>
@@ -1810,10 +1184,10 @@
       <w:color w:val="272727" w:themeColor="text1" w:themeTint="D8"/>
     </w:rPr>
   </w:style>
-  <w:style w:type="character" w:customStyle="1" w:styleId="90">
-    <w:name w:val="Заголовок 9 Знак"/>
-    <w:basedOn w:val="a0"/>
-    <w:link w:val="9"/>
+  <w:style w:type="character" w:customStyle="1" w:styleId="Heading9Char">
+    <w:name w:val="Heading 9 Char"/>
+    <w:basedOn w:val="DefaultParagraphFont"/>
+    <w:link w:val="Heading9"/>
     <w:uiPriority w:val="9"/>
     <w:semiHidden/>
     <w:rsid w:val="009C5BB0"/>
@@ -1822,11 +1196,11 @@
       <w:color w:val="272727" w:themeColor="text1" w:themeTint="D8"/>
     </w:rPr>
   </w:style>
-  <w:style w:type="paragraph" w:styleId="a3">
+  <w:style w:type="paragraph" w:styleId="Title">
     <w:name w:val="Title"/>
-    <w:basedOn w:val="a"/>
-    <w:next w:val="a"/>
-    <w:link w:val="a4"/>
+    <w:basedOn w:val="Normal"/>
+    <w:next w:val="Normal"/>
+    <w:link w:val="TitleChar"/>
     <w:uiPriority w:val="10"/>
     <w:qFormat/>
     <w:rsid w:val="009C5BB0"/>
@@ -1847,10 +1221,10 @@
       <w14:ligatures w14:val="standardContextual"/>
     </w:rPr>
   </w:style>
-  <w:style w:type="character" w:customStyle="1" w:styleId="a4">
-    <w:name w:val="Назва Знак"/>
-    <w:basedOn w:val="a0"/>
-    <w:link w:val="a3"/>
+  <w:style w:type="character" w:customStyle="1" w:styleId="TitleChar">
+    <w:name w:val="Title Char"/>
+    <w:basedOn w:val="DefaultParagraphFont"/>
+    <w:link w:val="Title"/>
     <w:uiPriority w:val="10"/>
     <w:rsid w:val="009C5BB0"/>
     <w:rPr>
@@ -1861,11 +1235,11 @@
       <w:szCs w:val="56"/>
     </w:rPr>
   </w:style>
-  <w:style w:type="paragraph" w:styleId="a5">
+  <w:style w:type="paragraph" w:styleId="Subtitle">
     <w:name w:val="Subtitle"/>
-    <w:basedOn w:val="a"/>
-    <w:next w:val="a"/>
-    <w:link w:val="a6"/>
+    <w:basedOn w:val="Normal"/>
+    <w:next w:val="Normal"/>
+    <w:link w:val="SubtitleChar"/>
     <w:uiPriority w:val="11"/>
     <w:qFormat/>
     <w:rsid w:val="009C5BB0"/>
@@ -1889,10 +1263,10 @@
       <w14:ligatures w14:val="standardContextual"/>
     </w:rPr>
   </w:style>
-  <w:style w:type="character" w:customStyle="1" w:styleId="a6">
-    <w:name w:val="Підзаголовок Знак"/>
-    <w:basedOn w:val="a0"/>
-    <w:link w:val="a5"/>
+  <w:style w:type="character" w:customStyle="1" w:styleId="SubtitleChar">
+    <w:name w:val="Subtitle Char"/>
+    <w:basedOn w:val="DefaultParagraphFont"/>
+    <w:link w:val="Subtitle"/>
     <w:uiPriority w:val="11"/>
     <w:rsid w:val="009C5BB0"/>
     <w:rPr>
@@ -1903,11 +1277,11 @@
       <w:szCs w:val="28"/>
     </w:rPr>
   </w:style>
-  <w:style w:type="paragraph" w:styleId="a7">
+  <w:style w:type="paragraph" w:styleId="Quote">
     <w:name w:val="Quote"/>
-    <w:basedOn w:val="a"/>
-    <w:next w:val="a"/>
-    <w:link w:val="a8"/>
+    <w:basedOn w:val="Normal"/>
+    <w:next w:val="Normal"/>
+    <w:link w:val="QuoteChar"/>
     <w:uiPriority w:val="29"/>
     <w:qFormat/>
     <w:rsid w:val="009C5BB0"/>
@@ -1928,10 +1302,10 @@
       <w14:ligatures w14:val="standardContextual"/>
     </w:rPr>
   </w:style>
-  <w:style w:type="character" w:customStyle="1" w:styleId="a8">
-    <w:name w:val="Цитата Знак"/>
-    <w:basedOn w:val="a0"/>
-    <w:link w:val="a7"/>
+  <w:style w:type="character" w:customStyle="1" w:styleId="QuoteChar">
+    <w:name w:val="Quote Char"/>
+    <w:basedOn w:val="DefaultParagraphFont"/>
+    <w:link w:val="Quote"/>
     <w:uiPriority w:val="29"/>
     <w:rsid w:val="009C5BB0"/>
     <w:rPr>
@@ -1940,9 +1314,9 @@
       <w:color w:val="404040" w:themeColor="text1" w:themeTint="BF"/>
     </w:rPr>
   </w:style>
-  <w:style w:type="paragraph" w:styleId="a9">
+  <w:style w:type="paragraph" w:styleId="ListParagraph">
     <w:name w:val="List Paragraph"/>
-    <w:basedOn w:val="a"/>
+    <w:basedOn w:val="Normal"/>
     <w:uiPriority w:val="34"/>
     <w:qFormat/>
     <w:rsid w:val="009C5BB0"/>
@@ -1961,9 +1335,9 @@
       <w14:ligatures w14:val="standardContextual"/>
     </w:rPr>
   </w:style>
-  <w:style w:type="character" w:styleId="aa">
+  <w:style w:type="character" w:styleId="IntenseEmphasis">
     <w:name w:val="Intense Emphasis"/>
-    <w:basedOn w:val="a0"/>
+    <w:basedOn w:val="DefaultParagraphFont"/>
     <w:uiPriority w:val="21"/>
     <w:qFormat/>
     <w:rsid w:val="009C5BB0"/>
@@ -1973,11 +1347,11 @@
       <w:color w:val="0F4761" w:themeColor="accent1" w:themeShade="BF"/>
     </w:rPr>
   </w:style>
-  <w:style w:type="paragraph" w:styleId="ab">
+  <w:style w:type="paragraph" w:styleId="IntenseQuote">
     <w:name w:val="Intense Quote"/>
-    <w:basedOn w:val="a"/>
-    <w:next w:val="a"/>
-    <w:link w:val="ac"/>
+    <w:basedOn w:val="Normal"/>
+    <w:next w:val="Normal"/>
+    <w:link w:val="IntenseQuoteChar"/>
     <w:uiPriority w:val="30"/>
     <w:qFormat/>
     <w:rsid w:val="009C5BB0"/>
@@ -2003,10 +1377,10 @@
       <w14:ligatures w14:val="standardContextual"/>
     </w:rPr>
   </w:style>
-  <w:style w:type="character" w:customStyle="1" w:styleId="ac">
-    <w:name w:val="Насичена цитата Знак"/>
-    <w:basedOn w:val="a0"/>
-    <w:link w:val="ab"/>
+  <w:style w:type="character" w:customStyle="1" w:styleId="IntenseQuoteChar">
+    <w:name w:val="Intense Quote Char"/>
+    <w:basedOn w:val="DefaultParagraphFont"/>
+    <w:link w:val="IntenseQuote"/>
     <w:uiPriority w:val="30"/>
     <w:rsid w:val="009C5BB0"/>
     <w:rPr>
@@ -2015,9 +1389,9 @@
       <w:color w:val="0F4761" w:themeColor="accent1" w:themeShade="BF"/>
     </w:rPr>
   </w:style>
-  <w:style w:type="character" w:styleId="ad">
+  <w:style w:type="character" w:styleId="IntenseReference">
     <w:name w:val="Intense Reference"/>
-    <w:basedOn w:val="a0"/>
+    <w:basedOn w:val="DefaultParagraphFont"/>
     <w:uiPriority w:val="32"/>
     <w:qFormat/>
     <w:rsid w:val="009C5BB0"/>
@@ -2029,10 +1403,10 @@
       <w:spacing w:val="5"/>
     </w:rPr>
   </w:style>
-  <w:style w:type="paragraph" w:styleId="ae">
+  <w:style w:type="paragraph" w:styleId="BodyText">
     <w:name w:val="Body Text"/>
-    <w:basedOn w:val="a"/>
-    <w:link w:val="af"/>
+    <w:basedOn w:val="Normal"/>
+    <w:link w:val="BodyTextChar"/>
     <w:uiPriority w:val="1"/>
     <w:qFormat/>
     <w:rsid w:val="00853E0C"/>
@@ -2044,10 +1418,10 @@
       <w:szCs w:val="28"/>
     </w:rPr>
   </w:style>
-  <w:style w:type="character" w:customStyle="1" w:styleId="af">
-    <w:name w:val="Основний текст Знак"/>
-    <w:basedOn w:val="a0"/>
-    <w:link w:val="ae"/>
+  <w:style w:type="character" w:customStyle="1" w:styleId="BodyTextChar">
+    <w:name w:val="Body Text Char"/>
+    <w:basedOn w:val="DefaultParagraphFont"/>
+    <w:link w:val="BodyText"/>
     <w:uiPriority w:val="1"/>
     <w:rsid w:val="00853E0C"/>
     <w:rPr>

</xml_diff>